<commit_message>
Major update to responible use of ai modules, new shiny helper app
</commit_message>
<xml_diff>
--- a/Documents/DSDP - AI Extension Introduction.docx
+++ b/Documents/DSDP - AI Extension Introduction.docx
@@ -241,7 +241,21 @@
           <w:rFonts w:ascii="Arial" w:eastAsia="Times New Roman" w:hAnsi="Arial" w:cs="Arial"/>
           <w:lang w:eastAsia="en-GB"/>
         </w:rPr>
-        <w:t xml:space="preserve"> – a 2-hour practical workshop using ChatGPT to analyse and critique policy-related outputs, incorporating structured exercises and group reflection.</w:t>
+        <w:t xml:space="preserve"> – a 2-hour practical workshop using </w:t>
+      </w:r>
+      <w:r>
+        <w:rPr>
+          <w:rFonts w:ascii="Arial" w:eastAsia="Times New Roman" w:hAnsi="Arial" w:cs="Arial"/>
+          <w:lang w:eastAsia="en-GB"/>
+        </w:rPr>
+        <w:t>Copilot</w:t>
+      </w:r>
+      <w:r>
+        <w:rPr>
+          <w:rFonts w:ascii="Arial" w:eastAsia="Times New Roman" w:hAnsi="Arial" w:cs="Arial"/>
+          <w:lang w:eastAsia="en-GB"/>
+        </w:rPr>
+        <w:t xml:space="preserve"> to analyse and critique policy-related outputs, incorporating structured exercises and group reflection.</w:t>
       </w:r>
     </w:p>
     <w:p>
@@ -326,7 +340,21 @@
           <w:rFonts w:ascii="Arial" w:eastAsia="Times New Roman" w:hAnsi="Arial" w:cs="Arial"/>
           <w:lang w:eastAsia="en-GB"/>
         </w:rPr>
-        <w:t>Practical exercises using ChatGPT to explore real-world policy and governance contexts.</w:t>
+        <w:t xml:space="preserve">Practical exercises using </w:t>
+      </w:r>
+      <w:r>
+        <w:rPr>
+          <w:rFonts w:ascii="Arial" w:eastAsia="Times New Roman" w:hAnsi="Arial" w:cs="Arial"/>
+          <w:lang w:eastAsia="en-GB"/>
+        </w:rPr>
+        <w:t>Copilot</w:t>
+      </w:r>
+      <w:r>
+        <w:rPr>
+          <w:rFonts w:ascii="Arial" w:eastAsia="Times New Roman" w:hAnsi="Arial" w:cs="Arial"/>
+          <w:lang w:eastAsia="en-GB"/>
+        </w:rPr>
+        <w:t xml:space="preserve"> to explore real-world policy and governance contexts.</w:t>
       </w:r>
     </w:p>
     <w:p>
@@ -713,21 +741,7 @@
           <w:rFonts w:ascii="Arial" w:eastAsia="Times New Roman" w:hAnsi="Arial" w:cs="Arial"/>
           <w:lang w:eastAsia="en-GB"/>
         </w:rPr>
-        <w:t xml:space="preserve">Developed familiarity with </w:t>
-      </w:r>
-      <w:r>
-        <w:rPr>
-          <w:rFonts w:ascii="Arial" w:eastAsia="Times New Roman" w:hAnsi="Arial" w:cs="Arial"/>
-          <w:lang w:eastAsia="en-GB"/>
-        </w:rPr>
-        <w:t>university</w:t>
-      </w:r>
-      <w:r>
-        <w:rPr>
-          <w:rFonts w:ascii="Arial" w:eastAsia="Times New Roman" w:hAnsi="Arial" w:cs="Arial"/>
-          <w:lang w:eastAsia="en-GB"/>
-        </w:rPr>
-        <w:t xml:space="preserve"> and sector guidance on responsible AI use.</w:t>
+        <w:t>Developed familiarity with university and sector guidance on responsible AI use.</w:t>
       </w:r>
     </w:p>
     <w:p>
@@ -747,7 +761,21 @@
           <w:rFonts w:ascii="Arial" w:eastAsia="Times New Roman" w:hAnsi="Arial" w:cs="Arial"/>
           <w:lang w:eastAsia="en-GB"/>
         </w:rPr>
-        <w:t>Acquired hands-on experience with ChatGPT for exploring and validating research policies.</w:t>
+        <w:t xml:space="preserve">Acquired hands-on experience with </w:t>
+      </w:r>
+      <w:r>
+        <w:rPr>
+          <w:rFonts w:ascii="Arial" w:eastAsia="Times New Roman" w:hAnsi="Arial" w:cs="Arial"/>
+          <w:lang w:eastAsia="en-GB"/>
+        </w:rPr>
+        <w:t>Copilot</w:t>
+      </w:r>
+      <w:r>
+        <w:rPr>
+          <w:rFonts w:ascii="Arial" w:eastAsia="Times New Roman" w:hAnsi="Arial" w:cs="Arial"/>
+          <w:lang w:eastAsia="en-GB"/>
+        </w:rPr>
+        <w:t xml:space="preserve"> for exploring and validating research policies.</w:t>
       </w:r>
     </w:p>
     <w:p>

</xml_diff>